<commit_message>
Document and present the curated public demo
</commit_message>
<xml_diff>
--- a/docs/sample/urgent_care_expansion_demo_report.docx
+++ b/docs/sample/urgent_care_expansion_demo_report.docx
@@ -24,7 +24,7 @@
           <w:color w:val="136F63"/>
           <w:sz w:val="30"/>
         </w:rPr>
-        <w:t>Synthetic public portfolio report</w:t>
+        <w:t>Curated real-market public portfolio</w:t>
       </w:r>
     </w:p>
     <w:p>
@@ -38,7 +38,7 @@
         <w:t xml:space="preserve">Boundary: </w:t>
       </w:r>
       <w:r>
-        <w:t>All markets, organizations, metrics, and opportunities are fictional. Scoring is illustrative.</w:t>
+        <w:t>Market geography and labeled public observations are real. Demo scores and sanitized scenarios are illustrative; production methodology is excluded.</w:t>
       </w:r>
     </w:p>
     <w:p>
@@ -127,7 +127,7 @@
               <w:rPr>
                 <w:sz w:val="16"/>
               </w:rPr>
-              <w:t>Is the synthetic market structurally attractive?</w:t>
+              <w:t>Do public observations indicate structural attractiveness?</w:t>
             </w:r>
           </w:p>
         </w:tc>
@@ -183,7 +183,7 @@
               <w:rPr>
                 <w:sz w:val="16"/>
               </w:rPr>
-              <w:t>Is there an illustrative listed, off-market, or real-estate path?</w:t>
+              <w:t>Is there a public or clearly illustrative near-term entry path?</w:t>
             </w:r>
           </w:p>
         </w:tc>
@@ -239,7 +239,7 @@
               <w:rPr>
                 <w:sz w:val="16"/>
               </w:rPr>
-              <w:t>Where should fictional diligence happen first?</w:t>
+              <w:t>Where should demo diligence happen first?</w:t>
             </w:r>
           </w:p>
         </w:tc>
@@ -328,7 +328,7 @@
                 <w:b/>
                 <w:sz w:val="16"/>
               </w:rPr>
-              <w:t>Near-Term</w:t>
+              <w:t>Demo Near-Term</w:t>
             </w:r>
           </w:p>
         </w:tc>
@@ -343,7 +343,7 @@
                 <w:b/>
                 <w:sz w:val="16"/>
               </w:rPr>
-              <w:t>Expansion</w:t>
+              <w:t>Demo Expansion</w:t>
             </w:r>
           </w:p>
         </w:tc>
@@ -358,7 +358,7 @@
                 <w:b/>
                 <w:sz w:val="16"/>
               </w:rPr>
-              <w:t>Entry</w:t>
+              <w:t>Demo Entry</w:t>
             </w:r>
           </w:p>
         </w:tc>
@@ -386,7 +386,7 @@
               <w:rPr>
                 <w:sz w:val="16"/>
               </w:rPr>
-              <w:t>Alder Riverfront</w:t>
+              <w:t>Hoffman Estates</w:t>
             </w:r>
           </w:p>
         </w:tc>
@@ -399,7 +399,7 @@
               <w:rPr>
                 <w:sz w:val="16"/>
               </w:rPr>
-              <w:t>Alder Bay</w:t>
+              <w:t>Chicago Northwest Suburbs</w:t>
             </w:r>
           </w:p>
         </w:tc>
@@ -412,7 +412,7 @@
               <w:rPr>
                 <w:sz w:val="16"/>
               </w:rPr>
-              <w:t>82.1</w:t>
+              <w:t>81.3</w:t>
             </w:r>
           </w:p>
         </w:tc>
@@ -425,7 +425,7 @@
               <w:rPr>
                 <w:sz w:val="16"/>
               </w:rPr>
-              <w:t>78.4</w:t>
+              <w:t>67.6</w:t>
             </w:r>
           </w:p>
         </w:tc>
@@ -438,7 +438,7 @@
               <w:rPr>
                 <w:sz w:val="16"/>
               </w:rPr>
-              <w:t>86.0</w:t>
+              <w:t>97.8</w:t>
             </w:r>
           </w:p>
         </w:tc>
@@ -466,7 +466,7 @@
               <w:rPr>
                 <w:sz w:val="16"/>
               </w:rPr>
-              <w:t>Lakehaven North</w:t>
+              <w:t>Royersford / Limerick</w:t>
             </w:r>
           </w:p>
         </w:tc>
@@ -479,7 +479,7 @@
               <w:rPr>
                 <w:sz w:val="16"/>
               </w:rPr>
-              <w:t>Lakehaven</w:t>
+              <w:t>Greater Philadelphia</w:t>
             </w:r>
           </w:p>
         </w:tc>
@@ -492,7 +492,7 @@
               <w:rPr>
                 <w:sz w:val="16"/>
               </w:rPr>
-              <w:t>78.6</w:t>
+              <w:t>70.9</w:t>
             </w:r>
           </w:p>
         </w:tc>
@@ -505,7 +505,7 @@
               <w:rPr>
                 <w:sz w:val="16"/>
               </w:rPr>
-              <w:t>71.9</w:t>
+              <w:t>59.5</w:t>
             </w:r>
           </w:p>
         </w:tc>
@@ -518,7 +518,7 @@
               <w:rPr>
                 <w:sz w:val="16"/>
               </w:rPr>
-              <w:t>86.0</w:t>
+              <w:t>84.4</w:t>
             </w:r>
           </w:p>
         </w:tc>
@@ -546,7 +546,7 @@
               <w:rPr>
                 <w:sz w:val="16"/>
               </w:rPr>
-              <w:t>Cedar Midtown</w:t>
+              <w:t>State College</w:t>
             </w:r>
           </w:p>
         </w:tc>
@@ -559,7 +559,7 @@
               <w:rPr>
                 <w:sz w:val="16"/>
               </w:rPr>
-              <w:t>Cedar Junction</w:t>
+              <w:t>State College</w:t>
             </w:r>
           </w:p>
         </w:tc>
@@ -572,7 +572,7 @@
               <w:rPr>
                 <w:sz w:val="16"/>
               </w:rPr>
-              <w:t>75.4</w:t>
+              <w:t>48.3</w:t>
             </w:r>
           </w:p>
         </w:tc>
@@ -585,7 +585,7 @@
               <w:rPr>
                 <w:sz w:val="16"/>
               </w:rPr>
-              <w:t>75.8</w:t>
+              <w:t>40.2</w:t>
             </w:r>
           </w:p>
         </w:tc>
@@ -598,7 +598,7 @@
               <w:rPr>
                 <w:sz w:val="16"/>
               </w:rPr>
-              <w:t>75.0</w:t>
+              <w:t>58.0</w:t>
             </w:r>
           </w:p>
         </w:tc>
@@ -619,12 +619,12 @@
         <w:pStyle w:val="Heading1"/>
       </w:pPr>
       <w:r>
-        <w:t>1. Alder Riverfront</w:t>
+        <w:t>1. Hoffman Estates</w:t>
       </w:r>
     </w:p>
     <w:p>
       <w:r>
-        <w:t>Alder Bay | Northland Demo | Synthetic market</w:t>
+        <w:t>Chicago Northwest Suburbs | Illinois | ZIP 60169</w:t>
       </w:r>
     </w:p>
     <w:tbl>
@@ -653,7 +653,7 @@
                 <w:b/>
                 <w:sz w:val="16"/>
               </w:rPr>
-              <w:t>Near-Term Priority</w:t>
+              <w:t>Demo Near-Term Priority</w:t>
             </w:r>
           </w:p>
         </w:tc>
@@ -683,7 +683,7 @@
                 <w:b/>
                 <w:sz w:val="16"/>
               </w:rPr>
-              <w:t>Entry Feasibility</w:t>
+              <w:t>Demo Entry Feasibility</w:t>
             </w:r>
           </w:p>
         </w:tc>
@@ -703,7 +703,7 @@
                 <w:color w:val="136F63"/>
                 <w:sz w:val="30"/>
               </w:rPr>
-              <w:t>82.1</w:t>
+              <w:t>81.3</w:t>
             </w:r>
           </w:p>
         </w:tc>
@@ -721,7 +721,7 @@
                 <w:color w:val="136F63"/>
                 <w:sz w:val="30"/>
               </w:rPr>
-              <w:t>78.4</w:t>
+              <w:t>67.6</w:t>
             </w:r>
           </w:p>
         </w:tc>
@@ -739,7 +739,7 @@
                 <w:color w:val="136F63"/>
                 <w:sz w:val="30"/>
               </w:rPr>
-              <w:t>86.0</w:t>
+              <w:t>97.8</w:t>
             </w:r>
           </w:p>
         </w:tc>
@@ -753,7 +753,7 @@
         <w:drawing>
           <wp:inline xmlns:a="http://schemas.openxmlformats.org/drawingml/2006/main" xmlns:pic="http://schemas.openxmlformats.org/drawingml/2006/picture">
             <wp:extent cx="5394960" cy="2157984"/>
-            <wp:docPr id="1" name="Picture 1" title="Synthetic market map" descr="Fictional market context for Alder Riverfront"/>
+            <wp:docPr id="1" name="Picture 1" title="Census ZCTA market geometry" descr="Census ZCTA geometry for Hoffman Estates"/>
             <wp:cNvGraphicFramePr>
               <a:graphicFrameLocks noChangeAspect="1"/>
             </wp:cNvGraphicFramePr>
@@ -761,7 +761,7 @@
               <a:graphicData uri="http://schemas.openxmlformats.org/drawingml/2006/picture">
                 <pic:pic>
                   <pic:nvPicPr>
-                    <pic:cNvPr id="0" name="map_1.png"/>
+                    <pic:cNvPr id="0" name="map_60169.png"/>
                     <pic:cNvPicPr/>
                   </pic:nvPicPr>
                   <pic:blipFill>
@@ -793,7 +793,7 @@
           <w:i/>
           <w:sz w:val="16"/>
         </w:rPr>
-        <w:t>Fictional market context</w:t>
+        <w:t>U.S. Census Bureau TIGERweb 2020 ZCTA geometry</w:t>
       </w:r>
     </w:p>
     <w:p>
@@ -872,7 +872,7 @@
               <w:rPr>
                 <w:sz w:val="16"/>
               </w:rPr>
-              <w:t>138,000</w:t>
+              <w:t>33,401</w:t>
             </w:r>
           </w:p>
         </w:tc>
@@ -900,7 +900,7 @@
               <w:rPr>
                 <w:sz w:val="16"/>
               </w:rPr>
-              <w:t>5.8%</w:t>
+              <w:t>0.1%</w:t>
             </w:r>
           </w:p>
         </w:tc>
@@ -928,7 +928,7 @@
               <w:rPr>
                 <w:sz w:val="16"/>
               </w:rPr>
-              <w:t>0.42  ++</w:t>
+              <w:t>0.60  ++</w:t>
             </w:r>
           </w:p>
         </w:tc>
@@ -943,7 +943,7 @@
               <w:rPr>
                 <w:sz w:val="16"/>
               </w:rPr>
-              <w:t>Healthcare Access Gap</w:t>
+              <w:t>Avg Competitor Rating</w:t>
             </w:r>
           </w:p>
         </w:tc>
@@ -956,7 +956,7 @@
               <w:rPr>
                 <w:sz w:val="16"/>
               </w:rPr>
-              <w:t>74</w:t>
+              <w:t>Not stored</w:t>
             </w:r>
           </w:p>
         </w:tc>
@@ -971,7 +971,7 @@
               <w:rPr>
                 <w:sz w:val="16"/>
               </w:rPr>
-              <w:t>Employment / Activity</w:t>
+              <w:t>Avg Weekly Open Hours</w:t>
             </w:r>
           </w:p>
         </w:tc>
@@ -984,7 +984,7 @@
               <w:rPr>
                 <w:sz w:val="16"/>
               </w:rPr>
-              <w:t>82</w:t>
+              <w:t>Not verified</w:t>
             </w:r>
           </w:p>
         </w:tc>
@@ -1101,7 +1101,7 @@
               <w:rPr>
                 <w:sz w:val="16"/>
               </w:rPr>
-              <w:t>DemoCare 1</w:t>
+              <w:t>Physicians Immediate Care</w:t>
             </w:r>
           </w:p>
         </w:tc>
@@ -1114,7 +1114,7 @@
               <w:rPr>
                 <w:sz w:val="16"/>
               </w:rPr>
-              <w:t>3.7</w:t>
+              <w:t>Not stored</w:t>
             </w:r>
           </w:p>
         </w:tc>
@@ -1127,7 +1127,7 @@
               <w:rPr>
                 <w:sz w:val="16"/>
               </w:rPr>
-              <w:t>279</w:t>
+              <w:t>Not stored</w:t>
             </w:r>
           </w:p>
         </w:tc>
@@ -1140,7 +1140,7 @@
               <w:rPr>
                 <w:sz w:val="16"/>
               </w:rPr>
-              <w:t>42</w:t>
+              <w:t>Not verified</w:t>
             </w:r>
           </w:p>
         </w:tc>
@@ -1153,7 +1153,7 @@
               <w:rPr>
                 <w:sz w:val="16"/>
               </w:rPr>
-              <w:t>urgent care</w:t>
+              <w:t>Urgent care</w:t>
             </w:r>
           </w:p>
         </w:tc>
@@ -1168,7 +1168,7 @@
               <w:rPr>
                 <w:sz w:val="16"/>
               </w:rPr>
-              <w:t>Northstar Clinic 2</w:t>
+              <w:t>Ascension Saint Alexius Immediate Care</w:t>
             </w:r>
           </w:p>
         </w:tc>
@@ -1181,7 +1181,7 @@
               <w:rPr>
                 <w:sz w:val="16"/>
               </w:rPr>
-              <w:t>3.8</w:t>
+              <w:t>Not stored</w:t>
             </w:r>
           </w:p>
         </w:tc>
@@ -1194,7 +1194,7 @@
               <w:rPr>
                 <w:sz w:val="16"/>
               </w:rPr>
-              <w:t>330</w:t>
+              <w:t>Not stored</w:t>
             </w:r>
           </w:p>
         </w:tc>
@@ -1207,7 +1207,7 @@
               <w:rPr>
                 <w:sz w:val="16"/>
               </w:rPr>
-              <w:t>47</w:t>
+              <w:t>Not verified</w:t>
             </w:r>
           </w:p>
         </w:tc>
@@ -1220,74 +1220,7 @@
               <w:rPr>
                 <w:sz w:val="16"/>
               </w:rPr>
-              <w:t>walk-in clinic</w:t>
-            </w:r>
-          </w:p>
-        </w:tc>
-      </w:tr>
-      <w:tr>
-        <w:tc>
-          <w:tcPr>
-            <w:tcW w:type="dxa" w:w="1987"/>
-          </w:tcPr>
-          <w:p>
-            <w:r>
-              <w:rPr>
-                <w:sz w:val="16"/>
-              </w:rPr>
-              <w:t>Civic Immediate Care 3</w:t>
-            </w:r>
-          </w:p>
-        </w:tc>
-        <w:tc>
-          <w:tcPr>
-            <w:tcW w:type="dxa" w:w="1987"/>
-          </w:tcPr>
-          <w:p>
-            <w:r>
-              <w:rPr>
-                <w:sz w:val="16"/>
-              </w:rPr>
-              <w:t>3.9</w:t>
-            </w:r>
-          </w:p>
-        </w:tc>
-        <w:tc>
-          <w:tcPr>
-            <w:tcW w:type="dxa" w:w="1987"/>
-          </w:tcPr>
-          <w:p>
-            <w:r>
-              <w:rPr>
-                <w:sz w:val="16"/>
-              </w:rPr>
-              <w:t>381</w:t>
-            </w:r>
-          </w:p>
-        </w:tc>
-        <w:tc>
-          <w:tcPr>
-            <w:tcW w:type="dxa" w:w="1987"/>
-          </w:tcPr>
-          <w:p>
-            <w:r>
-              <w:rPr>
-                <w:sz w:val="16"/>
-              </w:rPr>
-              <w:t>52</w:t>
-            </w:r>
-          </w:p>
-        </w:tc>
-        <w:tc>
-          <w:tcPr>
-            <w:tcW w:type="dxa" w:w="1987"/>
-          </w:tcPr>
-          <w:p>
-            <w:r>
-              <w:rPr>
-                <w:sz w:val="16"/>
-              </w:rPr>
-              <w:t>occupational health</w:t>
+              <w:t>Health-system immediate care</w:t>
             </w:r>
           </w:p>
         </w:tc>
@@ -1343,7 +1276,7 @@
                 <w:b/>
                 <w:sz w:val="16"/>
               </w:rPr>
-              <w:t>Illustrative opportunity</w:t>
+              <w:t>Opportunity / scenario</w:t>
             </w:r>
           </w:p>
         </w:tc>
@@ -1358,7 +1291,7 @@
                 <w:b/>
                 <w:sz w:val="16"/>
               </w:rPr>
-              <w:t>Score</w:t>
+              <w:t>Demo score</w:t>
             </w:r>
           </w:p>
         </w:tc>
@@ -1388,7 +1321,7 @@
               <w:rPr>
                 <w:sz w:val="16"/>
               </w:rPr>
-              <w:t>Listed acquisition</w:t>
+              <w:t>Public listed acquisition</w:t>
             </w:r>
           </w:p>
         </w:tc>
@@ -1401,7 +1334,7 @@
               <w:rPr>
                 <w:sz w:val="16"/>
               </w:rPr>
-              <w:t>Illustrative clinic acquisition listing</w:t>
+              <w:t>Premier OB/GYN &amp; Med Spa Practice - Chicago Suburb</w:t>
             </w:r>
           </w:p>
         </w:tc>
@@ -1414,61 +1347,7 @@
               <w:rPr>
                 <w:sz w:val="16"/>
               </w:rPr>
-              <w:t>90</w:t>
-            </w:r>
-          </w:p>
-        </w:tc>
-        <w:tc>
-          <w:tcPr>
-            <w:tcW w:type="dxa" w:w="2484"/>
-          </w:tcPr>
-          <w:p>
-            <w:r>
-              <w:rPr>
-                <w:sz w:val="16"/>
-              </w:rPr>
-              <w:t>High</w:t>
-            </w:r>
-          </w:p>
-        </w:tc>
-      </w:tr>
-      <w:tr>
-        <w:tc>
-          <w:tcPr>
-            <w:tcW w:type="dxa" w:w="2484"/>
-          </w:tcPr>
-          <w:p>
-            <w:r>
-              <w:rPr>
-                <w:sz w:val="16"/>
-              </w:rPr>
-              <w:t>Off-market target</w:t>
-            </w:r>
-          </w:p>
-        </w:tc>
-        <w:tc>
-          <w:tcPr>
-            <w:tcW w:type="dxa" w:w="2484"/>
-          </w:tcPr>
-          <w:p>
-            <w:r>
-              <w:rPr>
-                <w:sz w:val="16"/>
-              </w:rPr>
-              <w:t>Illustrative independent clinic target</w:t>
-            </w:r>
-          </w:p>
-        </w:tc>
-        <w:tc>
-          <w:tcPr>
-            <w:tcW w:type="dxa" w:w="2484"/>
-          </w:tcPr>
-          <w:p>
-            <w:r>
-              <w:rPr>
-                <w:sz w:val="16"/>
-              </w:rPr>
-              <w:t>90</w:t>
+              <w:t>92</w:t>
             </w:r>
           </w:p>
         </w:tc>
@@ -1509,7 +1388,7 @@
               <w:rPr>
                 <w:sz w:val="16"/>
               </w:rPr>
-              <w:t>Illustrative medical office site</w:t>
+              <w:t>Illustrative medical-office alternative</w:t>
             </w:r>
           </w:p>
         </w:tc>
@@ -1522,7 +1401,7 @@
               <w:rPr>
                 <w:sz w:val="16"/>
               </w:rPr>
-              <w:t>68</w:t>
+              <w:t>58</w:t>
             </w:r>
           </w:p>
         </w:tc>
@@ -1535,7 +1414,7 @@
               <w:rPr>
                 <w:sz w:val="16"/>
               </w:rPr>
-              <w:t>Medium</w:t>
+              <w:t>Low</w:t>
             </w:r>
           </w:p>
         </w:tc>
@@ -1649,7 +1528,7 @@
               <w:rPr>
                 <w:sz w:val="16"/>
               </w:rPr>
-              <w:t>77.9</w:t>
+              <w:t>46.2</w:t>
             </w:r>
           </w:p>
         </w:tc>
@@ -1675,7 +1554,7 @@
               <w:rPr>
                 <w:sz w:val="16"/>
               </w:rPr>
-              <w:t>19.5</w:t>
+              <w:t>11.6</w:t>
             </w:r>
           </w:p>
         </w:tc>
@@ -1703,7 +1582,7 @@
               <w:rPr>
                 <w:sz w:val="16"/>
               </w:rPr>
-              <w:t>90.7</w:t>
+              <w:t>49.0</w:t>
             </w:r>
           </w:p>
         </w:tc>
@@ -1729,7 +1608,7 @@
               <w:rPr>
                 <w:sz w:val="16"/>
               </w:rPr>
-              <w:t>18.1</w:t>
+              <w:t>9.8</w:t>
             </w:r>
           </w:p>
         </w:tc>
@@ -1757,7 +1636,7 @@
               <w:rPr>
                 <w:sz w:val="16"/>
               </w:rPr>
-              <w:t>72.2</w:t>
+              <w:t>81.8</w:t>
             </w:r>
           </w:p>
         </w:tc>
@@ -1783,7 +1662,7 @@
               <w:rPr>
                 <w:sz w:val="16"/>
               </w:rPr>
-              <w:t>18.1</w:t>
+              <w:t>20.5</w:t>
             </w:r>
           </w:p>
         </w:tc>
@@ -1811,7 +1690,7 @@
               <w:rPr>
                 <w:sz w:val="16"/>
               </w:rPr>
-              <w:t>74.0</w:t>
+              <w:t>100.0</w:t>
             </w:r>
           </w:p>
         </w:tc>
@@ -1837,7 +1716,7 @@
               <w:rPr>
                 <w:sz w:val="16"/>
               </w:rPr>
-              <w:t>11.1</w:t>
+              <w:t>15.0</w:t>
             </w:r>
           </w:p>
         </w:tc>
@@ -1865,7 +1744,7 @@
               <w:rPr>
                 <w:sz w:val="16"/>
               </w:rPr>
-              <w:t>82.0</w:t>
+              <w:t>71.9</w:t>
             </w:r>
           </w:p>
         </w:tc>
@@ -1891,7 +1770,7 @@
               <w:rPr>
                 <w:sz w:val="16"/>
               </w:rPr>
-              <w:t>12.3</w:t>
+              <w:t>10.8</w:t>
             </w:r>
           </w:p>
         </w:tc>
@@ -1899,7 +1778,7 @@
     </w:tbl>
     <w:p>
       <w:r>
-        <w:t>Source lineage: deterministic synthetic generator. No production source records are included.</w:t>
+        <w:t>Source lineage: ACS 2019/2024 5-year estimates, Census TIGERweb geometry, linked public operator pages, and explicitly labeled public or illustrative opportunity evidence. No production records are included.</w:t>
       </w:r>
     </w:p>
     <w:p>
@@ -1912,12 +1791,12 @@
         <w:pStyle w:val="Heading1"/>
       </w:pPr>
       <w:r>
-        <w:t>2. Lakehaven North</w:t>
+        <w:t>2. Royersford / Limerick</w:t>
       </w:r>
     </w:p>
     <w:p>
       <w:r>
-        <w:t>Lakehaven | Northland Demo | Synthetic market</w:t>
+        <w:t>Greater Philadelphia | Pennsylvania | ZIP 19468</w:t>
       </w:r>
     </w:p>
     <w:tbl>
@@ -1946,7 +1825,7 @@
                 <w:b/>
                 <w:sz w:val="16"/>
               </w:rPr>
-              <w:t>Near-Term Priority</w:t>
+              <w:t>Demo Near-Term Priority</w:t>
             </w:r>
           </w:p>
         </w:tc>
@@ -1976,7 +1855,7 @@
                 <w:b/>
                 <w:sz w:val="16"/>
               </w:rPr>
-              <w:t>Entry Feasibility</w:t>
+              <w:t>Demo Entry Feasibility</w:t>
             </w:r>
           </w:p>
         </w:tc>
@@ -1996,7 +1875,7 @@
                 <w:color w:val="136F63"/>
                 <w:sz w:val="30"/>
               </w:rPr>
-              <w:t>78.6</w:t>
+              <w:t>70.9</w:t>
             </w:r>
           </w:p>
         </w:tc>
@@ -2014,7 +1893,7 @@
                 <w:color w:val="136F63"/>
                 <w:sz w:val="30"/>
               </w:rPr>
-              <w:t>71.9</w:t>
+              <w:t>59.5</w:t>
             </w:r>
           </w:p>
         </w:tc>
@@ -2032,7 +1911,7 @@
                 <w:color w:val="136F63"/>
                 <w:sz w:val="30"/>
               </w:rPr>
-              <w:t>86.0</w:t>
+              <w:t>84.4</w:t>
             </w:r>
           </w:p>
         </w:tc>
@@ -2046,7 +1925,7 @@
         <w:drawing>
           <wp:inline xmlns:a="http://schemas.openxmlformats.org/drawingml/2006/main" xmlns:pic="http://schemas.openxmlformats.org/drawingml/2006/picture">
             <wp:extent cx="5394960" cy="2157984"/>
-            <wp:docPr id="2" name="Picture 2" title="Synthetic market map" descr="Fictional market context for Lakehaven North"/>
+            <wp:docPr id="2" name="Picture 2" title="Census ZCTA market geometry" descr="Census ZCTA geometry for Royersford / Limerick"/>
             <wp:cNvGraphicFramePr>
               <a:graphicFrameLocks noChangeAspect="1"/>
             </wp:cNvGraphicFramePr>
@@ -2054,7 +1933,7 @@
               <a:graphicData uri="http://schemas.openxmlformats.org/drawingml/2006/picture">
                 <pic:pic>
                   <pic:nvPicPr>
-                    <pic:cNvPr id="0" name="map_2.png"/>
+                    <pic:cNvPr id="0" name="map_19468.png"/>
                     <pic:cNvPicPr/>
                   </pic:nvPicPr>
                   <pic:blipFill>
@@ -2086,7 +1965,7 @@
           <w:i/>
           <w:sz w:val="16"/>
         </w:rPr>
-        <w:t>Fictional market context</w:t>
+        <w:t>U.S. Census Bureau TIGERweb 2020 ZCTA geometry</w:t>
       </w:r>
     </w:p>
     <w:p>
@@ -2165,7 +2044,7 @@
               <w:rPr>
                 <w:sz w:val="16"/>
               </w:rPr>
-              <w:t>87,000</w:t>
+              <w:t>28,194</w:t>
             </w:r>
           </w:p>
         </w:tc>
@@ -2193,7 +2072,7 @@
               <w:rPr>
                 <w:sz w:val="16"/>
               </w:rPr>
-              <w:t>5.1%</w:t>
+              <w:t>8.4%</w:t>
             </w:r>
           </w:p>
         </w:tc>
@@ -2221,7 +2100,7 @@
               <w:rPr>
                 <w:sz w:val="16"/>
               </w:rPr>
-              <w:t>0.36  ++</w:t>
+              <w:t>0.71  +</w:t>
             </w:r>
           </w:p>
         </w:tc>
@@ -2236,7 +2115,7 @@
               <w:rPr>
                 <w:sz w:val="16"/>
               </w:rPr>
-              <w:t>Healthcare Access Gap</w:t>
+              <w:t>Avg Competitor Rating</w:t>
             </w:r>
           </w:p>
         </w:tc>
@@ -2249,7 +2128,7 @@
               <w:rPr>
                 <w:sz w:val="16"/>
               </w:rPr>
-              <w:t>79</w:t>
+              <w:t>Not stored</w:t>
             </w:r>
           </w:p>
         </w:tc>
@@ -2264,7 +2143,7 @@
               <w:rPr>
                 <w:sz w:val="16"/>
               </w:rPr>
-              <w:t>Employment / Activity</w:t>
+              <w:t>Avg Weekly Open Hours</w:t>
             </w:r>
           </w:p>
         </w:tc>
@@ -2277,7 +2156,7 @@
               <w:rPr>
                 <w:sz w:val="16"/>
               </w:rPr>
-              <w:t>63</w:t>
+              <w:t>84</w:t>
             </w:r>
           </w:p>
         </w:tc>
@@ -2394,7 +2273,7 @@
               <w:rPr>
                 <w:sz w:val="16"/>
               </w:rPr>
-              <w:t>DemoCare 1</w:t>
+              <w:t>Tower Health Urgent Care - Limerick</w:t>
             </w:r>
           </w:p>
         </w:tc>
@@ -2407,7 +2286,7 @@
               <w:rPr>
                 <w:sz w:val="16"/>
               </w:rPr>
-              <w:t>4.2</w:t>
+              <w:t>Not stored</w:t>
             </w:r>
           </w:p>
         </w:tc>
@@ -2420,7 +2299,7 @@
               <w:rPr>
                 <w:sz w:val="16"/>
               </w:rPr>
-              <w:t>534</w:t>
+              <w:t>Not stored</w:t>
             </w:r>
           </w:p>
         </w:tc>
@@ -2433,7 +2312,7 @@
               <w:rPr>
                 <w:sz w:val="16"/>
               </w:rPr>
-              <w:t>67</w:t>
+              <w:t>84</w:t>
             </w:r>
           </w:p>
         </w:tc>
@@ -2446,7 +2325,7 @@
               <w:rPr>
                 <w:sz w:val="16"/>
               </w:rPr>
-              <w:t>urgent care</w:t>
+              <w:t>Health-system urgent care</w:t>
             </w:r>
           </w:p>
         </w:tc>
@@ -2461,7 +2340,7 @@
               <w:rPr>
                 <w:sz w:val="16"/>
               </w:rPr>
-              <w:t>Northstar Clinic 2</w:t>
+              <w:t>AFC Urgent Care Limerick</w:t>
             </w:r>
           </w:p>
         </w:tc>
@@ -2474,7 +2353,7 @@
               <w:rPr>
                 <w:sz w:val="16"/>
               </w:rPr>
-              <w:t>4.3</w:t>
+              <w:t>Not stored</w:t>
             </w:r>
           </w:p>
         </w:tc>
@@ -2487,7 +2366,7 @@
               <w:rPr>
                 <w:sz w:val="16"/>
               </w:rPr>
-              <w:t>636</w:t>
+              <w:t>Not stored</w:t>
             </w:r>
           </w:p>
         </w:tc>
@@ -2500,7 +2379,7 @@
               <w:rPr>
                 <w:sz w:val="16"/>
               </w:rPr>
-              <w:t>72</w:t>
+              <w:t>Not verified</w:t>
             </w:r>
           </w:p>
         </w:tc>
@@ -2513,74 +2392,7 @@
               <w:rPr>
                 <w:sz w:val="16"/>
               </w:rPr>
-              <w:t>walk-in clinic</w:t>
-            </w:r>
-          </w:p>
-        </w:tc>
-      </w:tr>
-      <w:tr>
-        <w:tc>
-          <w:tcPr>
-            <w:tcW w:type="dxa" w:w="1987"/>
-          </w:tcPr>
-          <w:p>
-            <w:r>
-              <w:rPr>
-                <w:sz w:val="16"/>
-              </w:rPr>
-              <w:t>Civic Immediate Care 3</w:t>
-            </w:r>
-          </w:p>
-        </w:tc>
-        <w:tc>
-          <w:tcPr>
-            <w:tcW w:type="dxa" w:w="1987"/>
-          </w:tcPr>
-          <w:p>
-            <w:r>
-              <w:rPr>
-                <w:sz w:val="16"/>
-              </w:rPr>
-              <w:t>4.4</w:t>
-            </w:r>
-          </w:p>
-        </w:tc>
-        <w:tc>
-          <w:tcPr>
-            <w:tcW w:type="dxa" w:w="1987"/>
-          </w:tcPr>
-          <w:p>
-            <w:r>
-              <w:rPr>
-                <w:sz w:val="16"/>
-              </w:rPr>
-              <w:t>738</w:t>
-            </w:r>
-          </w:p>
-        </w:tc>
-        <w:tc>
-          <w:tcPr>
-            <w:tcW w:type="dxa" w:w="1987"/>
-          </w:tcPr>
-          <w:p>
-            <w:r>
-              <w:rPr>
-                <w:sz w:val="16"/>
-              </w:rPr>
-              <w:t>77</w:t>
-            </w:r>
-          </w:p>
-        </w:tc>
-        <w:tc>
-          <w:tcPr>
-            <w:tcW w:type="dxa" w:w="1987"/>
-          </w:tcPr>
-          <w:p>
-            <w:r>
-              <w:rPr>
-                <w:sz w:val="16"/>
-              </w:rPr>
-              <w:t>occupational health</w:t>
+              <w:t>Urgent care</w:t>
             </w:r>
           </w:p>
         </w:tc>
@@ -2636,7 +2448,7 @@
                 <w:b/>
                 <w:sz w:val="16"/>
               </w:rPr>
-              <w:t>Illustrative opportunity</w:t>
+              <w:t>Opportunity / scenario</w:t>
             </w:r>
           </w:p>
         </w:tc>
@@ -2651,7 +2463,7 @@
                 <w:b/>
                 <w:sz w:val="16"/>
               </w:rPr>
-              <w:t>Score</w:t>
+              <w:t>Demo score</w:t>
             </w:r>
           </w:p>
         </w:tc>
@@ -2681,7 +2493,7 @@
               <w:rPr>
                 <w:sz w:val="16"/>
               </w:rPr>
-              <w:t>Listed acquisition</w:t>
+              <w:t>Sanitized off-market</w:t>
             </w:r>
           </w:p>
         </w:tc>
@@ -2694,7 +2506,7 @@
               <w:rPr>
                 <w:sz w:val="16"/>
               </w:rPr>
-              <w:t>Illustrative clinic acquisition listing</w:t>
+              <w:t>Illustrative Independent Operator</w:t>
             </w:r>
           </w:p>
         </w:tc>
@@ -2707,7 +2519,7 @@
               <w:rPr>
                 <w:sz w:val="16"/>
               </w:rPr>
-              <w:t>90</w:t>
+              <w:t>78</w:t>
             </w:r>
           </w:p>
         </w:tc>
@@ -2720,7 +2532,7 @@
               <w:rPr>
                 <w:sz w:val="16"/>
               </w:rPr>
-              <w:t>High</w:t>
+              <w:t>Medium</w:t>
             </w:r>
           </w:p>
         </w:tc>
@@ -2735,7 +2547,7 @@
               <w:rPr>
                 <w:sz w:val="16"/>
               </w:rPr>
-              <w:t>Off-market target</w:t>
+              <w:t>Real estate</w:t>
             </w:r>
           </w:p>
         </w:tc>
@@ -2748,7 +2560,7 @@
               <w:rPr>
                 <w:sz w:val="16"/>
               </w:rPr>
-              <w:t>Illustrative independent clinic target</w:t>
+              <w:t>Illustrative medical-office conversion path</w:t>
             </w:r>
           </w:p>
         </w:tc>
@@ -2761,7 +2573,7 @@
               <w:rPr>
                 <w:sz w:val="16"/>
               </w:rPr>
-              <w:t>80</w:t>
+              <w:t>64</w:t>
             </w:r>
           </w:p>
         </w:tc>
@@ -2774,7 +2586,7 @@
               <w:rPr>
                 <w:sz w:val="16"/>
               </w:rPr>
-              <w:t>Medium</w:t>
+              <w:t>Low</w:t>
             </w:r>
           </w:p>
         </w:tc>
@@ -2888,7 +2700,7 @@
               <w:rPr>
                 <w:sz w:val="16"/>
               </w:rPr>
-              <w:t>42.8</w:t>
+              <w:t>34.0</w:t>
             </w:r>
           </w:p>
         </w:tc>
@@ -2914,7 +2726,7 @@
               <w:rPr>
                 <w:sz w:val="16"/>
               </w:rPr>
-              <w:t>10.7</w:t>
+              <w:t>8.5</w:t>
             </w:r>
           </w:p>
         </w:tc>
@@ -2942,7 +2754,7 @@
               <w:rPr>
                 <w:sz w:val="16"/>
               </w:rPr>
-              <w:t>81.3</w:t>
+              <w:t>89.3</w:t>
             </w:r>
           </w:p>
         </w:tc>
@@ -2968,7 +2780,7 @@
               <w:rPr>
                 <w:sz w:val="16"/>
               </w:rPr>
-              <w:t>16.3</w:t>
+              <w:t>17.9</w:t>
             </w:r>
           </w:p>
         </w:tc>
@@ -2996,7 +2808,7 @@
               <w:rPr>
                 <w:sz w:val="16"/>
               </w:rPr>
-              <w:t>77.6</w:t>
+              <w:t>72.7</w:t>
             </w:r>
           </w:p>
         </w:tc>
@@ -3022,7 +2834,7 @@
               <w:rPr>
                 <w:sz w:val="16"/>
               </w:rPr>
-              <w:t>19.4</w:t>
+              <w:t>18.2</w:t>
             </w:r>
           </w:p>
         </w:tc>
@@ -3050,7 +2862,7 @@
               <w:rPr>
                 <w:sz w:val="16"/>
               </w:rPr>
-              <w:t>79.0</w:t>
+              <w:t>0.0</w:t>
             </w:r>
           </w:p>
         </w:tc>
@@ -3076,7 +2888,7 @@
               <w:rPr>
                 <w:sz w:val="16"/>
               </w:rPr>
-              <w:t>11.9</w:t>
+              <w:t>0.0</w:t>
             </w:r>
           </w:p>
         </w:tc>
@@ -3104,7 +2916,7 @@
               <w:rPr>
                 <w:sz w:val="16"/>
               </w:rPr>
-              <w:t>63.0</w:t>
+              <w:t>100.0</w:t>
             </w:r>
           </w:p>
         </w:tc>
@@ -3130,7 +2942,7 @@
               <w:rPr>
                 <w:sz w:val="16"/>
               </w:rPr>
-              <w:t>9.5</w:t>
+              <w:t>15.0</w:t>
             </w:r>
           </w:p>
         </w:tc>
@@ -3138,7 +2950,7 @@
     </w:tbl>
     <w:p>
       <w:r>
-        <w:t>Source lineage: deterministic synthetic generator. No production source records are included.</w:t>
+        <w:t>Source lineage: ACS 2019/2024 5-year estimates, Census TIGERweb geometry, linked public operator pages, and explicitly labeled public or illustrative opportunity evidence. No production records are included.</w:t>
       </w:r>
     </w:p>
     <w:p>
@@ -3151,12 +2963,12 @@
         <w:pStyle w:val="Heading1"/>
       </w:pPr>
       <w:r>
-        <w:t>3. Cedar Midtown</w:t>
+        <w:t>3. State College</w:t>
       </w:r>
     </w:p>
     <w:p>
       <w:r>
-        <w:t>Cedar Junction | Southridge Demo | Synthetic market</w:t>
+        <w:t>State College | Pennsylvania | ZIP 16801</w:t>
       </w:r>
     </w:p>
     <w:tbl>
@@ -3185,7 +2997,7 @@
                 <w:b/>
                 <w:sz w:val="16"/>
               </w:rPr>
-              <w:t>Near-Term Priority</w:t>
+              <w:t>Demo Near-Term Priority</w:t>
             </w:r>
           </w:p>
         </w:tc>
@@ -3215,7 +3027,7 @@
                 <w:b/>
                 <w:sz w:val="16"/>
               </w:rPr>
-              <w:t>Entry Feasibility</w:t>
+              <w:t>Demo Entry Feasibility</w:t>
             </w:r>
           </w:p>
         </w:tc>
@@ -3235,7 +3047,7 @@
                 <w:color w:val="136F63"/>
                 <w:sz w:val="30"/>
               </w:rPr>
-              <w:t>75.4</w:t>
+              <w:t>48.3</w:t>
             </w:r>
           </w:p>
         </w:tc>
@@ -3253,7 +3065,7 @@
                 <w:color w:val="136F63"/>
                 <w:sz w:val="30"/>
               </w:rPr>
-              <w:t>75.8</w:t>
+              <w:t>40.2</w:t>
             </w:r>
           </w:p>
         </w:tc>
@@ -3271,7 +3083,7 @@
                 <w:color w:val="136F63"/>
                 <w:sz w:val="30"/>
               </w:rPr>
-              <w:t>75.0</w:t>
+              <w:t>58.0</w:t>
             </w:r>
           </w:p>
         </w:tc>
@@ -3285,7 +3097,7 @@
         <w:drawing>
           <wp:inline xmlns:a="http://schemas.openxmlformats.org/drawingml/2006/main" xmlns:pic="http://schemas.openxmlformats.org/drawingml/2006/picture">
             <wp:extent cx="5394960" cy="2157984"/>
-            <wp:docPr id="3" name="Picture 3" title="Synthetic market map" descr="Fictional market context for Cedar Midtown"/>
+            <wp:docPr id="3" name="Picture 3" title="Census ZCTA market geometry" descr="Census ZCTA geometry for State College"/>
             <wp:cNvGraphicFramePr>
               <a:graphicFrameLocks noChangeAspect="1"/>
             </wp:cNvGraphicFramePr>
@@ -3293,7 +3105,7 @@
               <a:graphicData uri="http://schemas.openxmlformats.org/drawingml/2006/picture">
                 <pic:pic>
                   <pic:nvPicPr>
-                    <pic:cNvPr id="0" name="map_3.png"/>
+                    <pic:cNvPr id="0" name="map_16801.png"/>
                     <pic:cNvPicPr/>
                   </pic:nvPicPr>
                   <pic:blipFill>
@@ -3325,7 +3137,7 @@
           <w:i/>
           <w:sz w:val="16"/>
         </w:rPr>
-        <w:t>Fictional market context</w:t>
+        <w:t>U.S. Census Bureau TIGERweb 2020 ZCTA geometry</w:t>
       </w:r>
     </w:p>
     <w:p>
@@ -3404,7 +3216,7 @@
               <w:rPr>
                 <w:sz w:val="16"/>
               </w:rPr>
-              <w:t>168,000</w:t>
+              <w:t>40,774</w:t>
             </w:r>
           </w:p>
         </w:tc>
@@ -3432,7 +3244,7 @@
               <w:rPr>
                 <w:sz w:val="16"/>
               </w:rPr>
-              <w:t>4.9%</w:t>
+              <w:t>-10.0%</w:t>
             </w:r>
           </w:p>
         </w:tc>
@@ -3460,7 +3272,7 @@
               <w:rPr>
                 <w:sz w:val="16"/>
               </w:rPr>
-              <w:t>0.47  ++</w:t>
+              <w:t>0.50  ++</w:t>
             </w:r>
           </w:p>
         </w:tc>
@@ -3475,7 +3287,7 @@
               <w:rPr>
                 <w:sz w:val="16"/>
               </w:rPr>
-              <w:t>Healthcare Access Gap</w:t>
+              <w:t>Avg Competitor Rating</w:t>
             </w:r>
           </w:p>
         </w:tc>
@@ -3488,7 +3300,7 @@
               <w:rPr>
                 <w:sz w:val="16"/>
               </w:rPr>
-              <w:t>71</w:t>
+              <w:t>Not stored</w:t>
             </w:r>
           </w:p>
         </w:tc>
@@ -3503,7 +3315,7 @@
               <w:rPr>
                 <w:sz w:val="16"/>
               </w:rPr>
-              <w:t>Employment / Activity</w:t>
+              <w:t>Avg Weekly Open Hours</w:t>
             </w:r>
           </w:p>
         </w:tc>
@@ -3516,7 +3328,7 @@
               <w:rPr>
                 <w:sz w:val="16"/>
               </w:rPr>
-              <w:t>91</w:t>
+              <w:t>75</w:t>
             </w:r>
           </w:p>
         </w:tc>
@@ -3633,7 +3445,7 @@
               <w:rPr>
                 <w:sz w:val="16"/>
               </w:rPr>
-              <w:t>DemoCare 1</w:t>
+              <w:t>Geisinger ConvenientCare State College</w:t>
             </w:r>
           </w:p>
         </w:tc>
@@ -3646,7 +3458,7 @@
               <w:rPr>
                 <w:sz w:val="16"/>
               </w:rPr>
-              <w:t>4.3</w:t>
+              <w:t>Not stored</w:t>
             </w:r>
           </w:p>
         </w:tc>
@@ -3659,7 +3471,7 @@
               <w:rPr>
                 <w:sz w:val="16"/>
               </w:rPr>
-              <w:t>687</w:t>
+              <w:t>Not stored</w:t>
             </w:r>
           </w:p>
         </w:tc>
@@ -3672,7 +3484,7 @@
               <w:rPr>
                 <w:sz w:val="16"/>
               </w:rPr>
-              <w:t>47</w:t>
+              <w:t>75</w:t>
             </w:r>
           </w:p>
         </w:tc>
@@ -3685,7 +3497,7 @@
               <w:rPr>
                 <w:sz w:val="16"/>
               </w:rPr>
-              <w:t>urgent care</w:t>
+              <w:t>Health-system urgent care</w:t>
             </w:r>
           </w:p>
         </w:tc>
@@ -3700,7 +3512,7 @@
               <w:rPr>
                 <w:sz w:val="16"/>
               </w:rPr>
-              <w:t>Northstar Clinic 2</w:t>
+              <w:t>MedExpress Urgent Care - State College</w:t>
             </w:r>
           </w:p>
         </w:tc>
@@ -3713,7 +3525,7 @@
               <w:rPr>
                 <w:sz w:val="16"/>
               </w:rPr>
-              <w:t>4.4</w:t>
+              <w:t>Not stored</w:t>
             </w:r>
           </w:p>
         </w:tc>
@@ -3726,7 +3538,7 @@
               <w:rPr>
                 <w:sz w:val="16"/>
               </w:rPr>
-              <w:t>738</w:t>
+              <w:t>Not stored</w:t>
             </w:r>
           </w:p>
         </w:tc>
@@ -3739,7 +3551,7 @@
               <w:rPr>
                 <w:sz w:val="16"/>
               </w:rPr>
-              <w:t>52</w:t>
+              <w:t>Not verified</w:t>
             </w:r>
           </w:p>
         </w:tc>
@@ -3752,74 +3564,7 @@
               <w:rPr>
                 <w:sz w:val="16"/>
               </w:rPr>
-              <w:t>walk-in clinic</w:t>
-            </w:r>
-          </w:p>
-        </w:tc>
-      </w:tr>
-      <w:tr>
-        <w:tc>
-          <w:tcPr>
-            <w:tcW w:type="dxa" w:w="1987"/>
-          </w:tcPr>
-          <w:p>
-            <w:r>
-              <w:rPr>
-                <w:sz w:val="16"/>
-              </w:rPr>
-              <w:t>Civic Immediate Care 3</w:t>
-            </w:r>
-          </w:p>
-        </w:tc>
-        <w:tc>
-          <w:tcPr>
-            <w:tcW w:type="dxa" w:w="1987"/>
-          </w:tcPr>
-          <w:p>
-            <w:r>
-              <w:rPr>
-                <w:sz w:val="16"/>
-              </w:rPr>
-              <w:t>4.5</w:t>
-            </w:r>
-          </w:p>
-        </w:tc>
-        <w:tc>
-          <w:tcPr>
-            <w:tcW w:type="dxa" w:w="1987"/>
-          </w:tcPr>
-          <w:p>
-            <w:r>
-              <w:rPr>
-                <w:sz w:val="16"/>
-              </w:rPr>
-              <w:t>789</w:t>
-            </w:r>
-          </w:p>
-        </w:tc>
-        <w:tc>
-          <w:tcPr>
-            <w:tcW w:type="dxa" w:w="1987"/>
-          </w:tcPr>
-          <w:p>
-            <w:r>
-              <w:rPr>
-                <w:sz w:val="16"/>
-              </w:rPr>
-              <w:t>57</w:t>
-            </w:r>
-          </w:p>
-        </w:tc>
-        <w:tc>
-          <w:tcPr>
-            <w:tcW w:type="dxa" w:w="1987"/>
-          </w:tcPr>
-          <w:p>
-            <w:r>
-              <w:rPr>
-                <w:sz w:val="16"/>
-              </w:rPr>
-              <w:t>occupational health</w:t>
+              <w:t>Urgent care</w:t>
             </w:r>
           </w:p>
         </w:tc>
@@ -3875,7 +3620,7 @@
                 <w:b/>
                 <w:sz w:val="16"/>
               </w:rPr>
-              <w:t>Illustrative opportunity</w:t>
+              <w:t>Opportunity / scenario</w:t>
             </w:r>
           </w:p>
         </w:tc>
@@ -3890,7 +3635,7 @@
                 <w:b/>
                 <w:sz w:val="16"/>
               </w:rPr>
-              <w:t>Score</w:t>
+              <w:t>Demo score</w:t>
             </w:r>
           </w:p>
         </w:tc>
@@ -3920,60 +3665,6 @@
               <w:rPr>
                 <w:sz w:val="16"/>
               </w:rPr>
-              <w:t>Off-market target</w:t>
-            </w:r>
-          </w:p>
-        </w:tc>
-        <w:tc>
-          <w:tcPr>
-            <w:tcW w:type="dxa" w:w="2484"/>
-          </w:tcPr>
-          <w:p>
-            <w:r>
-              <w:rPr>
-                <w:sz w:val="16"/>
-              </w:rPr>
-              <w:t>Illustrative independent clinic target</w:t>
-            </w:r>
-          </w:p>
-        </w:tc>
-        <w:tc>
-          <w:tcPr>
-            <w:tcW w:type="dxa" w:w="2484"/>
-          </w:tcPr>
-          <w:p>
-            <w:r>
-              <w:rPr>
-                <w:sz w:val="16"/>
-              </w:rPr>
-              <w:t>60</w:t>
-            </w:r>
-          </w:p>
-        </w:tc>
-        <w:tc>
-          <w:tcPr>
-            <w:tcW w:type="dxa" w:w="2484"/>
-          </w:tcPr>
-          <w:p>
-            <w:r>
-              <w:rPr>
-                <w:sz w:val="16"/>
-              </w:rPr>
-              <w:t>Medium</w:t>
-            </w:r>
-          </w:p>
-        </w:tc>
-      </w:tr>
-      <w:tr>
-        <w:tc>
-          <w:tcPr>
-            <w:tcW w:type="dxa" w:w="2484"/>
-          </w:tcPr>
-          <w:p>
-            <w:r>
-              <w:rPr>
-                <w:sz w:val="16"/>
-              </w:rPr>
               <w:t>Real estate</w:t>
             </w:r>
           </w:p>
@@ -3987,7 +3678,7 @@
               <w:rPr>
                 <w:sz w:val="16"/>
               </w:rPr>
-              <w:t>Illustrative medical office site</w:t>
+              <w:t>Illustrative medical-office search</w:t>
             </w:r>
           </w:p>
         </w:tc>
@@ -4000,7 +3691,7 @@
               <w:rPr>
                 <w:sz w:val="16"/>
               </w:rPr>
-              <w:t>72</w:t>
+              <w:t>58</w:t>
             </w:r>
           </w:p>
         </w:tc>
@@ -4013,7 +3704,7 @@
               <w:rPr>
                 <w:sz w:val="16"/>
               </w:rPr>
-              <w:t>Medium</w:t>
+              <w:t>Low</w:t>
             </w:r>
           </w:p>
         </w:tc>
@@ -4127,7 +3818,7 @@
               <w:rPr>
                 <w:sz w:val="16"/>
               </w:rPr>
-              <w:t>98.6</w:t>
+              <w:t>63.5</w:t>
             </w:r>
           </w:p>
         </w:tc>
@@ -4153,7 +3844,7 @@
               <w:rPr>
                 <w:sz w:val="16"/>
               </w:rPr>
-              <w:t>24.7</w:t>
+              <w:t>15.9</w:t>
             </w:r>
           </w:p>
         </w:tc>
@@ -4181,7 +3872,7 @@
               <w:rPr>
                 <w:sz w:val="16"/>
               </w:rPr>
-              <w:t>78.7</w:t>
+              <w:t>0.0</w:t>
             </w:r>
           </w:p>
         </w:tc>
@@ -4207,7 +3898,7 @@
               <w:rPr>
                 <w:sz w:val="16"/>
               </w:rPr>
-              <w:t>15.7</w:t>
+              <w:t>0.0</w:t>
             </w:r>
           </w:p>
         </w:tc>
@@ -4235,7 +3926,7 @@
               <w:rPr>
                 <w:sz w:val="16"/>
               </w:rPr>
-              <w:t>67.7</w:t>
+              <w:t>90.9</w:t>
             </w:r>
           </w:p>
         </w:tc>
@@ -4261,7 +3952,7 @@
               <w:rPr>
                 <w:sz w:val="16"/>
               </w:rPr>
-              <w:t>16.9</w:t>
+              <w:t>22.7</w:t>
             </w:r>
           </w:p>
         </w:tc>
@@ -4289,7 +3980,7 @@
               <w:rPr>
                 <w:sz w:val="16"/>
               </w:rPr>
-              <w:t>71.0</w:t>
+              <w:t>10.6</w:t>
             </w:r>
           </w:p>
         </w:tc>
@@ -4315,7 +4006,7 @@
               <w:rPr>
                 <w:sz w:val="16"/>
               </w:rPr>
-              <w:t>10.7</w:t>
+              <w:t>1.6</w:t>
             </w:r>
           </w:p>
         </w:tc>
@@ -4343,7 +4034,7 @@
               <w:rPr>
                 <w:sz w:val="16"/>
               </w:rPr>
-              <w:t>91.0</w:t>
+              <w:t>0.0</w:t>
             </w:r>
           </w:p>
         </w:tc>
@@ -4369,7 +4060,7 @@
               <w:rPr>
                 <w:sz w:val="16"/>
               </w:rPr>
-              <w:t>13.7</w:t>
+              <w:t>0.0</w:t>
             </w:r>
           </w:p>
         </w:tc>
@@ -4377,7 +4068,7 @@
     </w:tbl>
     <w:p>
       <w:r>
-        <w:t>Source lineage: deterministic synthetic generator. No production source records are included.</w:t>
+        <w:t>Source lineage: ACS 2019/2024 5-year estimates, Census TIGERweb geometry, linked public operator pages, and explicitly labeled public or illustrative opportunity evidence. No production records are included.</w:t>
       </w:r>
     </w:p>
     <w:sectPr>

</xml_diff>